<commit_message>
Added medium results comparison
</commit_message>
<xml_diff>
--- a/Research Paper.docx
+++ b/Research Paper.docx
@@ -1,6 +1,6 @@
 
 <file path=word/document.xml><?xml version="1.0" encoding="utf-8"?>
-<w:document xmlns:wpc="http://schemas.microsoft.com/office/word/2010/wordprocessingCanvas" xmlns:cx="http://schemas.microsoft.com/office/drawing/2014/chartex" xmlns:cx1="http://schemas.microsoft.com/office/drawing/2015/9/8/chartex" xmlns:cx2="http://schemas.microsoft.com/office/drawing/2015/10/21/chartex" xmlns:cx3="http://schemas.microsoft.com/office/drawing/2016/5/9/chartex" xmlns:cx4="http://schemas.microsoft.com/office/drawing/2016/5/10/chartex" xmlns:cx5="http://schemas.microsoft.com/office/drawing/2016/5/11/chartex" xmlns:cx6="http://schemas.microsoft.com/office/drawing/2016/5/12/chartex" xmlns:cx7="http://schemas.microsoft.com/office/drawing/2016/5/13/chartex" xmlns:cx8="http://schemas.microsoft.com/office/drawing/2016/5/14/chartex" xmlns:mc="http://schemas.openxmlformats.org/markup-compatibility/2006" xmlns:m="http://schemas.openxmlformats.org/officeDocument/2006/math" xmlns:aink="http://schemas.microsoft.com/office/drawing/2016/ink" xmlns:am3d="http://schemas.microsoft.com/office/drawing/2017/model3d" xmlns:oel="http://schemas.microsoft.com/office/2019/extlst" xmlns:r="http://schemas.openxmlformats.org/officeDocument/2006/relationships" xmlns:wp14="http://schemas.microsoft.com/office/word/2010/wordprocessingDrawing" xmlns:wp="http://schemas.openxmlformats.org/drawingml/2006/wordprocessingDrawing" xmlns:wpg="http://schemas.microsoft.com/office/word/2010/wordprocessingGroup" xmlns:wpi="http://schemas.microsoft.com/office/word/2010/wordprocessingInk" xmlns:wps="http://schemas.microsoft.com/office/word/2010/wordprocessingShape" xmlns:o="urn:schemas-microsoft-com:office:office" xmlns:v="urn:schemas-microsoft-com:vml" xmlns:w10="urn:schemas-microsoft-com:office:word" xmlns:w="http://schemas.openxmlformats.org/wordprocessingml/2006/main" xmlns:w14="http://schemas.microsoft.com/office/word/2010/wordml" xmlns:w15="http://schemas.microsoft.com/office/word/2012/wordml" xmlns:w16cei="http://schemas.microsoft.com/office/word/2026/wordml/cei" xmlns:w16cex="http://schemas.microsoft.com/office/word/2018/wordml/cex" xmlns:w16cid="http://schemas.microsoft.com/office/word/2016/wordml/cid" xmlns:w16="http://schemas.microsoft.com/office/word/2018/wordml" xmlns:w16sdtdh="http://schemas.microsoft.com/office/word/2020/wordml/sdtdatahash" xmlns:w16sdtfl="http://schemas.microsoft.com/office/word/2024/wordml/sdtformatlock" xmlns:w16se="http://schemas.microsoft.com/office/word/2015/wordml/symex" xmlns:w16du="http://schemas.microsoft.com/office/word/2023/wordml/word16du" xmlns:wne="http://schemas.microsoft.com/office/word/2006/wordml" mc:Ignorable="w14 w15 w16se w16cid w16 w16cex w16sdtdh w16sdtfl w16du wp14">
+<w:document xmlns:wpc="http://schemas.microsoft.com/office/word/2010/wordprocessingCanvas" xmlns:cx="http://schemas.microsoft.com/office/drawing/2014/chartex" xmlns:cx1="http://schemas.microsoft.com/office/drawing/2015/9/8/chartex" xmlns:cx2="http://schemas.microsoft.com/office/drawing/2015/10/21/chartex" xmlns:cx3="http://schemas.microsoft.com/office/drawing/2016/5/9/chartex" xmlns:cx4="http://schemas.microsoft.com/office/drawing/2016/5/10/chartex" xmlns:cx5="http://schemas.microsoft.com/office/drawing/2016/5/11/chartex" xmlns:cx6="http://schemas.microsoft.com/office/drawing/2016/5/12/chartex" xmlns:cx7="http://schemas.microsoft.com/office/drawing/2016/5/13/chartex" xmlns:cx8="http://schemas.microsoft.com/office/drawing/2016/5/14/chartex" xmlns:mc="http://schemas.openxmlformats.org/markup-compatibility/2006" xmlns:m="http://schemas.openxmlformats.org/officeDocument/2006/math" xmlns:aink="http://schemas.microsoft.com/office/drawing/2016/ink" xmlns:am3d="http://schemas.microsoft.com/office/drawing/2017/model3d" xmlns:oel="http://schemas.microsoft.com/office/2019/extlst" xmlns:r="http://schemas.openxmlformats.org/officeDocument/2006/relationships" xmlns:wp14="http://schemas.microsoft.com/office/word/2010/wordprocessingDrawing" xmlns:wp="http://schemas.openxmlformats.org/drawingml/2006/wordprocessingDrawing" xmlns:wpg="http://schemas.microsoft.com/office/word/2010/wordprocessingGroup" xmlns:wpi="http://schemas.microsoft.com/office/word/2010/wordprocessingInk" xmlns:wps="http://schemas.microsoft.com/office/word/2010/wordprocessingShape" xmlns:o="urn:schemas-microsoft-com:office:office" xmlns:v="urn:schemas-microsoft-com:vml" xmlns:w10="urn:schemas-microsoft-com:office:word" xmlns:w="http://schemas.openxmlformats.org/wordprocessingml/2006/main" xmlns:w14="http://schemas.microsoft.com/office/word/2010/wordml" xmlns:w15="http://schemas.microsoft.com/office/word/2012/wordml" xmlns:w16cex="http://schemas.microsoft.com/office/word/2018/wordml/cex" xmlns:w16cid="http://schemas.microsoft.com/office/word/2016/wordml/cid" xmlns:w16="http://schemas.microsoft.com/office/word/2018/wordml" xmlns:w16sdtdh="http://schemas.microsoft.com/office/word/2020/wordml/sdtdatahash" xmlns:w16sdtfl="http://schemas.microsoft.com/office/word/2024/wordml/sdtformatlock" xmlns:w16se="http://schemas.microsoft.com/office/word/2015/wordml/symex" xmlns:w16du="http://schemas.microsoft.com/office/word/2023/wordml/word16du" xmlns:wne="http://schemas.microsoft.com/office/word/2006/wordml" mc:Ignorable="w14 w15 w16se w16cid w16 w16cex w16sdtdh w16sdtfl w16du wp14">
   <w:body>
     <w:p>
       <w:pPr>
@@ -51,16 +51,171 @@
     </w:p>
     <w:p>
       <w:r>
-        <w:t xml:space="preserve">A word error rate that is five points higher is not an abstraction for the speaker on the wrong side of it. Speech recognition already screens job applicants through automated interviews, transcribes clinical notes, and routes emergency and customer service calls, and in each case a failed transcript transfers the cost of the error onto the person speaking. No major vendor currently publishes error rates disaggregated by accent, so this cost stays invisible to the people paying it. This study demonstrates that such an audit requires no proprietary access and no </w:t>
-      </w:r>
-      <w:r>
-        <w:t>specialized</w:t>
-      </w:r>
-      <w:r>
-        <w:t xml:space="preserve"> hardware: a controlled comparison can be run on a consumer laptop using open models and a public corpus. Accountability here is a matter of choice, not capability.</w:t>
-      </w:r>
-    </w:p>
-    <w:p/>
+        <w:t>A word error rate that is five points higher is not an abstraction for the speaker on the wrong side of it. Speech recognition already screens job applicants through automated interviews, transcribes clinical notes, and routes emergency and customer service calls, and in each case a failed transcript transfers the cost of the error onto the person speaking. No major vendor currently publishes error rates disaggregated by accent, so this cost stays invisible to the people paying it. This study demonstrates that such an audit requires no proprietary access and no specialized hardware: a controlled comparison can be run on a consumer laptop using open models and a public corpus. Accountability here is a matter of choice, not capability.</w:t>
+      </w:r>
+    </w:p>
+    <w:p>
+      <w:pPr>
+        <w:pStyle w:val="Heading1"/>
+      </w:pPr>
+      <w:r>
+        <w:lastRenderedPageBreak/>
+        <w:t>Results</w:t>
+      </w:r>
+    </w:p>
+    <w:p>
+      <w:pPr>
+        <w:rPr>
+          <w:color w:val="auto"/>
+          <w:kern w:val="0"/>
+        </w:rPr>
+      </w:pPr>
+      <w:r>
+        <w:rPr>
+          <w:rStyle w:val="Strong"/>
+        </w:rPr>
+        <w:t>Whisper produces higher word error rates for Indian English at every model size.</w:t>
+      </w:r>
+      <w:r>
+        <w:t xml:space="preserve"> Across 120 recordings of the same 69-word passage, Whisper transcribed American-accented English more accurately than Indian-accented English in all four model sizes tested. On whisper-tiny, mean WER was 4.52% (SE 0.62) for American speakers and 8.86% (SE 1.48) for Indian speakers. On whisper-base, 3.26% (SE 0.51) versus 7.34% (SE 0.56). On whisper-small, 1.52% (SE 0.27) versus 4.76% (SE 0.53). On whisper-medium, 1.09% (SE 0.21) versus 5.65% (SE 1.68). Every comparison was significant by one-sided Mann-Whitney U test (p = 2.5 × 10⁻⁴, 3.3 × 10⁻⁸, 1.9 × 10⁻⁷, and 9.5 × 10⁻⁸ respectively).</w:t>
+      </w:r>
+    </w:p>
+    <w:p>
+      <w:r>
+        <w:rPr>
+          <w:rStyle w:val="Emphasis"/>
+        </w:rPr>
+        <w:t>[Figure 1: WER by accent group across Whisper model sizes]</w:t>
+      </w:r>
+    </w:p>
+    <w:p>
+      <w:r>
+        <w:rPr>
+          <w:rStyle w:val="Strong"/>
+        </w:rPr>
+        <w:t>Scale reduces absolute error but does not close the gap.</w:t>
+      </w:r>
+      <w:r>
+        <w:t xml:space="preserve"> Moving from tiny to medium cut American WER by 76% and Indian WER by 36%. The absolute gap, however, remained essentially flat across the entire range, at 4.35, 4.08, 3.24, and 4.57 percentage points for tiny, base, small, and medium. Because the American baseline fell faster than the gap, the disparity ratio widened monotonically with scale, from 1.96× at tiny to 2.25× at base, 3.13× at small, and 5.20× at medium. A tenfold increase in parameters improved recognition for both groups but delivered that improvement unequally, leaving Indian speakers relatively further behind than they began.</w:t>
+      </w:r>
+    </w:p>
+    <w:p>
+      <w:r>
+        <w:rPr>
+          <w:rStyle w:val="Emphasis"/>
+        </w:rPr>
+        <w:t>[Figure 2: Disparity ratio as a function of model size]</w:t>
+      </w:r>
+    </w:p>
+    <w:p>
+      <w:r>
+        <w:rPr>
+          <w:rStyle w:val="Strong"/>
+        </w:rPr>
+        <w:lastRenderedPageBreak/>
+        <w:t>The distribution of errors is more unequal than the means suggest.</w:t>
+      </w:r>
+      <w:r>
+        <w:t xml:space="preserve"> At whisper-medium, 34 of 60 American recordings were transcribed with zero errors, against 16 of 60 Indian recordings. The Indian group also carried a heavier upper tail: 90th-percentile WER at medium was 3.04% for American speakers and 8.70% for Indian speakers. Two Indian clips failed catastrophically, one reaching 85.5% WER at tiny and another 101.5% at medium, the latter exceeding 100% because the model inserted more words than the reference contained. No American clip in any condition exceeded 21%. Whisper-medium logged 80 insertions on Indian audio against 10 on American audio, indicating that the model's failure mode on unfamiliar acoustics is hallucination rather than omission. Excluding the single hallucinated clip lowers Indian medium WER from 5.65% to 4.03%, which does not eliminate the gap but shows how much of the headline mean is carried by a small number of severe failures.</w:t>
+      </w:r>
+    </w:p>
+    <w:p>
+      <w:r>
+        <w:rPr>
+          <w:rStyle w:val="Emphasis"/>
+        </w:rPr>
+        <w:t>[Figure 3: Per-clip WER distribution by group and model size]</w:t>
+      </w:r>
+    </w:p>
+    <w:p>
+      <w:r>
+        <w:rPr>
+          <w:rStyle w:val="Strong"/>
+        </w:rPr>
+        <w:t>A large share of the measured gap is orthographic, not acoustic.</w:t>
+      </w:r>
+      <w:r>
+        <w:t xml:space="preserve"> Inspecting substitution pairs revealed that the three most frequent errors on Indian audio at every model size above tiny were "six" transcribed as "6", "five" as "5", and "three" as "3". These are formatting decisions, not misrecognitions: the model heard the word correctly and rendered it as a numeral. The </w:t>
+      </w:r>
+      <w:proofErr w:type="spellStart"/>
+      <w:r>
+        <w:t>behaviour</w:t>
+      </w:r>
+      <w:proofErr w:type="spellEnd"/>
+      <w:r>
+        <w:t xml:space="preserve"> was strongly asymmetric. At whisper-small, 30 of 60 Indian clips contained digit output against 0 of 60 American clips; at base, 41 versus 6; at medium, 32 versus 0. Re-scoring with numerals mapped back to words reduced Indian WER at small from 4.76% to 2.66% and at medium from 5.65% to 3.38%, leaving American figures unchanged. The gap narrowed but survived, to 1.75× at small (p = 0.025) and 1.77× at tiny (p = 0.003). The remaining substitutions were genuinely </w:t>
+      </w:r>
+      <w:r>
+        <w:lastRenderedPageBreak/>
+        <w:t>phonetic, clustering on voiceless fricatives and consonant clusters: "slabs" heard as "slaps" (9 occurrences at medium), "snake" as "snack", "frog" as "frock", and "snow" as "nose".</w:t>
+      </w:r>
+    </w:p>
+    <w:p>
+      <w:r>
+        <w:rPr>
+          <w:rStyle w:val="Emphasis"/>
+        </w:rPr>
+        <w:t>[Table 1: Most frequent substitution pairs by group]</w:t>
+      </w:r>
+    </w:p>
+    <w:p>
+      <w:r>
+        <w:t xml:space="preserve">This result carries a methodological consequence beyond this study. Standard WER </w:t>
+      </w:r>
+      <w:proofErr w:type="spellStart"/>
+      <w:r>
+        <w:t>penalises</w:t>
+      </w:r>
+      <w:proofErr w:type="spellEnd"/>
+      <w:r>
+        <w:t xml:space="preserve"> orthographic convention identically to genuine error, so an ASR system that merely formats non-native speech differently will register as less accurate. Any audit reporting raw WER without number </w:t>
+      </w:r>
+      <w:r>
+        <w:t>normalization</w:t>
+      </w:r>
+      <w:r>
+        <w:t xml:space="preserve"> will overstate the acoustic disparity, and the direction of that overstatement is not neutral.</w:t>
+      </w:r>
+    </w:p>
+    <w:p>
+      <w:r>
+        <w:rPr>
+          <w:rStyle w:val="Strong"/>
+        </w:rPr>
+        <w:t xml:space="preserve">The pattern </w:t>
+      </w:r>
+      <w:proofErr w:type="spellStart"/>
+      <w:r>
+        <w:rPr>
+          <w:rStyle w:val="Strong"/>
+        </w:rPr>
+        <w:t>generalises</w:t>
+      </w:r>
+      <w:proofErr w:type="spellEnd"/>
+      <w:r>
+        <w:rPr>
+          <w:rStyle w:val="Strong"/>
+        </w:rPr>
+        <w:t xml:space="preserve"> across architectures.</w:t>
+      </w:r>
+      <w:r>
+        <w:t xml:space="preserve"> Two additional systems were evaluated on the identical corpus. Meta's wav2vec-based model produced 5.97% WER for American English and 9.13% for Indian English, a ratio of 1.53× (p = 2.6 × 10⁻⁵). NVIDIA's Parakeet performed best overall, at 0.92% and 1.74% respectively, a ratio of 1.89× (p = 0.046). Neither model emitted numerals in any transcription, so their gaps are unadjusted and fully acoustic. Parakeet's near-perfect American performance and its 31 error-free Indian transcriptions out of 60 show that low absolute error and a persistent relative gap are compatible: the best-performing system in the study still </w:t>
+      </w:r>
+      <w:r>
+        <w:t>misrecognized</w:t>
+      </w:r>
+      <w:r>
+        <w:t xml:space="preserve"> Indian English at roughly twice the rate of American English.</w:t>
+      </w:r>
+    </w:p>
+    <w:p>
+      <w:r>
+        <w:rPr>
+          <w:rStyle w:val="Emphasis"/>
+        </w:rPr>
+        <w:t>[Figure 4: Cross-architecture comparison, Whisper versus Meta versus NVIDIA]</w:t>
+      </w:r>
+    </w:p>
     <w:p/>
     <w:p/>
     <w:sectPr>
@@ -1017,6 +1172,41 @@
       <w:kern w:val="0"/>
     </w:rPr>
   </w:style>
+  <w:style w:type="paragraph" w:customStyle="1" w:styleId="font-claude-response-body">
+    <w:name w:val="font-claude-response-body"/>
+    <w:basedOn w:val="Normal"/>
+    <w:rsid w:val="00E6410C"/>
+    <w:pPr>
+      <w:spacing w:before="100" w:beforeAutospacing="1" w:after="100" w:afterAutospacing="1" w:line="240" w:lineRule="auto"/>
+      <w:outlineLvl w:val="9"/>
+    </w:pPr>
+    <w:rPr>
+      <w:color w:val="auto"/>
+      <w:kern w:val="0"/>
+    </w:rPr>
+  </w:style>
+  <w:style w:type="character" w:styleId="Strong">
+    <w:name w:val="Strong"/>
+    <w:basedOn w:val="DefaultParagraphFont"/>
+    <w:uiPriority w:val="22"/>
+    <w:qFormat/>
+    <w:rsid w:val="00E6410C"/>
+    <w:rPr>
+      <w:b/>
+      <w:bCs/>
+    </w:rPr>
+  </w:style>
+  <w:style w:type="character" w:styleId="Emphasis">
+    <w:name w:val="Emphasis"/>
+    <w:basedOn w:val="DefaultParagraphFont"/>
+    <w:uiPriority w:val="20"/>
+    <w:qFormat/>
+    <w:rsid w:val="00E6410C"/>
+    <w:rPr>
+      <w:i/>
+      <w:iCs/>
+    </w:rPr>
+  </w:style>
 </w:styles>
 </file>
 

</xml_diff>